<commit_message>
abstact and introduction added to report
</commit_message>
<xml_diff>
--- a/Project Report.docx
+++ b/Project Report.docx
@@ -59,55 +59,7 @@
           <w:sz w:val="26"/>
           <w:szCs w:val="26"/>
         </w:rPr>
-        <w:t xml:space="preserve">This project </w:t>
-      </w:r>
-      <w:r>
-        <w:rPr>
-          <w:rFonts w:ascii="Poppins" w:hAnsi="Poppins" w:cs="Poppins"/>
-          <w:sz w:val="26"/>
-          <w:szCs w:val="26"/>
-        </w:rPr>
-        <w:t>analyses</w:t>
-      </w:r>
-      <w:r>
-        <w:rPr>
-          <w:rFonts w:ascii="Poppins" w:hAnsi="Poppins" w:cs="Poppins"/>
-          <w:sz w:val="26"/>
-          <w:szCs w:val="26"/>
-        </w:rPr>
-        <w:t xml:space="preserve"> the World Development Indicators dataset from the World Bank, focusing on financial inclusion, health, poverty, education, and social protection metrics for Pakistan, with comparisons to developed countries. The study addresses research questions exploring the impact of financial stability on poverty and education, the relationship between education and social protection issues, and how poverty affects health outcomes. Through exploratory data analysis (EDA), data preprocessing, and correlation analysis, significant trends and relationships were identified, such as strong correlations between financial access indicators and price indices, and links between education </w:t>
-      </w:r>
-      <w:r>
-        <w:rPr>
-          <w:rFonts w:ascii="Poppins" w:hAnsi="Poppins" w:cs="Poppins"/>
-          <w:sz w:val="26"/>
-          <w:szCs w:val="26"/>
-        </w:rPr>
-        <w:t>enrolment</w:t>
-      </w:r>
-      <w:r>
-        <w:rPr>
-          <w:rFonts w:ascii="Poppins" w:hAnsi="Poppins" w:cs="Poppins"/>
-          <w:sz w:val="26"/>
-          <w:szCs w:val="26"/>
-        </w:rPr>
-        <w:t xml:space="preserve"> and poverty reduction. Challenges like missing data and cross-country comparability were addressed using imputation and normalization techniques. The findings highlight persistent gender disparities, high child </w:t>
-      </w:r>
-      <w:r>
-        <w:rPr>
-          <w:rFonts w:ascii="Poppins" w:hAnsi="Poppins" w:cs="Poppins"/>
-          <w:sz w:val="26"/>
-          <w:szCs w:val="26"/>
-        </w:rPr>
-        <w:t>labour</w:t>
-      </w:r>
-      <w:r>
-        <w:rPr>
-          <w:rFonts w:ascii="Poppins" w:hAnsi="Poppins" w:cs="Poppins"/>
-          <w:sz w:val="26"/>
-          <w:szCs w:val="26"/>
-        </w:rPr>
-        <w:t xml:space="preserve"> rates, and the need for targeted policy interventions to enhance financial inclusion, education access, and social protection in Pakistan, offering a data-driven foundation for sustainable development strategies.</w:t>
+        <w:t>This project analyses the World Development Indicators dataset from the World Bank, focusing on financial inclusion, health, poverty, education, and social protection metrics for Pakistan, with comparisons to developed countries. The study addresses research questions exploring the impact of financial stability on poverty and education, the relationship between education and social protection issues, and how poverty affects health outcomes. Through exploratory data analysis (EDA), data preprocessing, and correlation analysis, significant trends and relationships were identified, such as strong correlations between financial access indicators and price indices, and links between education enrolment and poverty reduction. Challenges like missing data and cross-country comparability were addressed using imputation and normalization techniques. The findings highlight persistent gender disparities, high child labour rates, and the need for targeted policy interventions to enhance financial inclusion, education access, and social protection in Pakistan, offering a data-driven foundation for sustainable development strategies.</w:t>
       </w:r>
     </w:p>
     <w:p>
@@ -298,7 +250,29 @@
           <w:sz w:val="64"/>
           <w:szCs w:val="64"/>
         </w:rPr>
-        <w:t>Phase – I : Project Proposal.</w:t>
+        <w:t xml:space="preserve">Phase – </w:t>
+      </w:r>
+      <w:proofErr w:type="gramStart"/>
+      <w:r>
+        <w:rPr>
+          <w:rFonts w:ascii="Poppins" w:hAnsi="Poppins" w:cs="Poppins"/>
+          <w:b/>
+          <w:bCs/>
+          <w:sz w:val="64"/>
+          <w:szCs w:val="64"/>
+        </w:rPr>
+        <w:t>I :</w:t>
+      </w:r>
+      <w:proofErr w:type="gramEnd"/>
+      <w:r>
+        <w:rPr>
+          <w:rFonts w:ascii="Poppins" w:hAnsi="Poppins" w:cs="Poppins"/>
+          <w:b/>
+          <w:bCs/>
+          <w:sz w:val="64"/>
+          <w:szCs w:val="64"/>
+        </w:rPr>
+        <w:t xml:space="preserve"> Project Proposal.</w:t>
       </w:r>
     </w:p>
     <w:p>
@@ -366,7 +340,25 @@
           <w:sz w:val="26"/>
           <w:szCs w:val="26"/>
         </w:rPr>
-        <w:t xml:space="preserve">Write a brief proposal including: o Dataset source and description </w:t>
+        <w:t xml:space="preserve">Write a brief proposal </w:t>
+      </w:r>
+      <w:proofErr w:type="gramStart"/>
+      <w:r>
+        <w:rPr>
+          <w:rFonts w:ascii="Poppins" w:hAnsi="Poppins" w:cs="Poppins"/>
+          <w:sz w:val="26"/>
+          <w:szCs w:val="26"/>
+        </w:rPr>
+        <w:t>including:</w:t>
+      </w:r>
+      <w:proofErr w:type="gramEnd"/>
+      <w:r>
+        <w:rPr>
+          <w:rFonts w:ascii="Poppins" w:hAnsi="Poppins" w:cs="Poppins"/>
+          <w:sz w:val="26"/>
+          <w:szCs w:val="26"/>
+        </w:rPr>
+        <w:t xml:space="preserve"> o Dataset source and description </w:t>
       </w:r>
       <w:proofErr w:type="spellStart"/>
       <w:r>
@@ -1351,7 +1343,29 @@
           <w:sz w:val="64"/>
           <w:szCs w:val="64"/>
         </w:rPr>
-        <w:t>Phase – II : Exploratory Data Analysis (EDA)</w:t>
+        <w:t xml:space="preserve">Phase – </w:t>
+      </w:r>
+      <w:proofErr w:type="gramStart"/>
+      <w:r>
+        <w:rPr>
+          <w:rFonts w:ascii="Poppins" w:hAnsi="Poppins" w:cs="Poppins"/>
+          <w:b/>
+          <w:bCs/>
+          <w:sz w:val="64"/>
+          <w:szCs w:val="64"/>
+        </w:rPr>
+        <w:t>II :</w:t>
+      </w:r>
+      <w:proofErr w:type="gramEnd"/>
+      <w:r>
+        <w:rPr>
+          <w:rFonts w:ascii="Poppins" w:hAnsi="Poppins" w:cs="Poppins"/>
+          <w:b/>
+          <w:bCs/>
+          <w:sz w:val="64"/>
+          <w:szCs w:val="64"/>
+        </w:rPr>
+        <w:t xml:space="preserve"> Exploratory Data Analysis (EDA)</w:t>
       </w:r>
     </w:p>
     <w:p>
@@ -1597,7 +1611,61 @@
           <w:sz w:val="26"/>
           <w:szCs w:val="26"/>
         </w:rPr>
-        <w:t>Account ownership at financial institutions or mobile-money providers (% of population 15+, total: FX.OWN.TOTL.ZS, female: FX.OWN.TOTL.FE.ZS, male: FX.OWN.TOTL.MA.ZS, poorest 40%: FX.OWN.TOTL.40.ZS).</w:t>
+        <w:t xml:space="preserve">Account ownership at financial institutions or mobile-money providers (% of population 15+, total: </w:t>
+      </w:r>
+      <w:proofErr w:type="gramStart"/>
+      <w:r>
+        <w:rPr>
+          <w:rFonts w:ascii="Poppins" w:hAnsi="Poppins" w:cs="Poppins"/>
+          <w:sz w:val="26"/>
+          <w:szCs w:val="26"/>
+        </w:rPr>
+        <w:t>FX.OWN.TOTL.ZS</w:t>
+      </w:r>
+      <w:proofErr w:type="gramEnd"/>
+      <w:r>
+        <w:rPr>
+          <w:rFonts w:ascii="Poppins" w:hAnsi="Poppins" w:cs="Poppins"/>
+          <w:sz w:val="26"/>
+          <w:szCs w:val="26"/>
+        </w:rPr>
+        <w:t>, female: FX.OWN.TOTL.</w:t>
+      </w:r>
+      <w:proofErr w:type="gramStart"/>
+      <w:r>
+        <w:rPr>
+          <w:rFonts w:ascii="Poppins" w:hAnsi="Poppins" w:cs="Poppins"/>
+          <w:sz w:val="26"/>
+          <w:szCs w:val="26"/>
+        </w:rPr>
+        <w:t>FE.ZS</w:t>
+      </w:r>
+      <w:proofErr w:type="gramEnd"/>
+      <w:r>
+        <w:rPr>
+          <w:rFonts w:ascii="Poppins" w:hAnsi="Poppins" w:cs="Poppins"/>
+          <w:sz w:val="26"/>
+          <w:szCs w:val="26"/>
+        </w:rPr>
+        <w:t>, male: FX.OWN.TOTL.MA.ZS, poorest 40%: FX.OWN.TOTL.</w:t>
+      </w:r>
+      <w:proofErr w:type="gramStart"/>
+      <w:r>
+        <w:rPr>
+          <w:rFonts w:ascii="Poppins" w:hAnsi="Poppins" w:cs="Poppins"/>
+          <w:sz w:val="26"/>
+          <w:szCs w:val="26"/>
+        </w:rPr>
+        <w:t>40.ZS</w:t>
+      </w:r>
+      <w:proofErr w:type="gramEnd"/>
+      <w:r>
+        <w:rPr>
+          <w:rFonts w:ascii="Poppins" w:hAnsi="Poppins" w:cs="Poppins"/>
+          <w:sz w:val="26"/>
+          <w:szCs w:val="26"/>
+        </w:rPr>
+        <w:t>).</w:t>
       </w:r>
     </w:p>
     <w:p>
@@ -1618,7 +1686,25 @@
           <w:sz w:val="26"/>
           <w:szCs w:val="26"/>
         </w:rPr>
-        <w:t>ATMs per 100,000 adults (FB.ATM.TOTL.P5).</w:t>
+        <w:t>ATMs per 100,000 adults (</w:t>
+      </w:r>
+      <w:proofErr w:type="gramStart"/>
+      <w:r>
+        <w:rPr>
+          <w:rFonts w:ascii="Poppins" w:hAnsi="Poppins" w:cs="Poppins"/>
+          <w:sz w:val="26"/>
+          <w:szCs w:val="26"/>
+        </w:rPr>
+        <w:t>FB.ATM.TOTL.P</w:t>
+      </w:r>
+      <w:proofErr w:type="gramEnd"/>
+      <w:r>
+        <w:rPr>
+          <w:rFonts w:ascii="Poppins" w:hAnsi="Poppins" w:cs="Poppins"/>
+          <w:sz w:val="26"/>
+          <w:szCs w:val="26"/>
+        </w:rPr>
+        <w:t>5).</w:t>
       </w:r>
     </w:p>
     <w:p>
@@ -1639,7 +1725,25 @@
           <w:sz w:val="26"/>
           <w:szCs w:val="26"/>
         </w:rPr>
-        <w:t>Commercial bank branches per 100,000 adults (FB.CBK.BRCH.P5).</w:t>
+        <w:t>Commercial bank branches per 100,000 adults (</w:t>
+      </w:r>
+      <w:proofErr w:type="gramStart"/>
+      <w:r>
+        <w:rPr>
+          <w:rFonts w:ascii="Poppins" w:hAnsi="Poppins" w:cs="Poppins"/>
+          <w:sz w:val="26"/>
+          <w:szCs w:val="26"/>
+        </w:rPr>
+        <w:t>FB.CBK.BRCH.P</w:t>
+      </w:r>
+      <w:proofErr w:type="gramEnd"/>
+      <w:r>
+        <w:rPr>
+          <w:rFonts w:ascii="Poppins" w:hAnsi="Poppins" w:cs="Poppins"/>
+          <w:sz w:val="26"/>
+          <w:szCs w:val="26"/>
+        </w:rPr>
+        <w:t>5).</w:t>
       </w:r>
     </w:p>
     <w:p>
@@ -1709,7 +1813,25 @@
           <w:sz w:val="26"/>
           <w:szCs w:val="26"/>
         </w:rPr>
-        <w:t>Sparse data before 2011, with constant values (e.g., 16.405% for FX.OWN.TOTL.ZS from 1960–2010) indicating imputation.</w:t>
+        <w:t xml:space="preserve">Sparse data before 2011, with constant values (e.g., 16.405% for </w:t>
+      </w:r>
+      <w:proofErr w:type="gramStart"/>
+      <w:r>
+        <w:rPr>
+          <w:rFonts w:ascii="Poppins" w:hAnsi="Poppins" w:cs="Poppins"/>
+          <w:sz w:val="26"/>
+          <w:szCs w:val="26"/>
+        </w:rPr>
+        <w:t>FX.OWN.TOTL.ZS</w:t>
+      </w:r>
+      <w:proofErr w:type="gramEnd"/>
+      <w:r>
+        <w:rPr>
+          <w:rFonts w:ascii="Poppins" w:hAnsi="Poppins" w:cs="Poppins"/>
+          <w:sz w:val="26"/>
+          <w:szCs w:val="26"/>
+        </w:rPr>
+        <w:t xml:space="preserve"> from 1960–2010) indicating imputation.</w:t>
       </w:r>
     </w:p>
     <w:p>
@@ -1820,7 +1942,7 @@
           <w:szCs w:val="26"/>
         </w:rPr>
         <w:lastRenderedPageBreak/>
-        <w:t>2. Health Indicators Data (4f2f6b82-aa5d-429f-80d4-564ae648423d_Data.csv)</w:t>
+        <w:t>2. Health Indicators Data</w:t>
       </w:r>
     </w:p>
     <w:p>
@@ -1928,7 +2050,25 @@
           <w:sz w:val="26"/>
           <w:szCs w:val="26"/>
         </w:rPr>
-        <w:t>Population pushed below $2.15 poverty line due to out-of-pocket healthcare costs (SH.UHC.NOP1.ZS).</w:t>
+        <w:t>Population pushed below $2.15 poverty line due to out-of-pocket healthcare costs (SH.UHC.NOP</w:t>
+      </w:r>
+      <w:proofErr w:type="gramStart"/>
+      <w:r>
+        <w:rPr>
+          <w:rFonts w:ascii="Poppins" w:hAnsi="Poppins" w:cs="Poppins"/>
+          <w:sz w:val="26"/>
+          <w:szCs w:val="26"/>
+        </w:rPr>
+        <w:t>1.ZS</w:t>
+      </w:r>
+      <w:proofErr w:type="gramEnd"/>
+      <w:r>
+        <w:rPr>
+          <w:rFonts w:ascii="Poppins" w:hAnsi="Poppins" w:cs="Poppins"/>
+          <w:sz w:val="26"/>
+          <w:szCs w:val="26"/>
+        </w:rPr>
+        <w:t>).</w:t>
       </w:r>
     </w:p>
     <w:p>
@@ -2197,7 +2337,6 @@
           <w:sz w:val="26"/>
           <w:szCs w:val="26"/>
         </w:rPr>
-        <w:lastRenderedPageBreak/>
         <w:t xml:space="preserve">Key Indicators: </w:t>
       </w:r>
     </w:p>
@@ -2219,6 +2358,7 @@
           <w:sz w:val="26"/>
           <w:szCs w:val="26"/>
         </w:rPr>
+        <w:lastRenderedPageBreak/>
         <w:t>Poverty headcount ratio at $2.15 a day (2017 PPP, SI.POV.DDAY).</w:t>
       </w:r>
     </w:p>
@@ -2509,7 +2649,25 @@
           <w:sz w:val="26"/>
           <w:szCs w:val="26"/>
         </w:rPr>
-        <w:t>Adjusted net enrolment rate, primary (% of primary school age children, total: SE.PRM.TENR, female: SE.PRM.TENR.FE, male: SE.PRM.TENR.MA).</w:t>
+        <w:t xml:space="preserve">Adjusted net enrolment rate, primary (% of primary school age children, total: SE.PRM.TENR, female: </w:t>
+      </w:r>
+      <w:proofErr w:type="gramStart"/>
+      <w:r>
+        <w:rPr>
+          <w:rFonts w:ascii="Poppins" w:hAnsi="Poppins" w:cs="Poppins"/>
+          <w:sz w:val="26"/>
+          <w:szCs w:val="26"/>
+        </w:rPr>
+        <w:t>SE.PRM.TENR.FE</w:t>
+      </w:r>
+      <w:proofErr w:type="gramEnd"/>
+      <w:r>
+        <w:rPr>
+          <w:rFonts w:ascii="Poppins" w:hAnsi="Poppins" w:cs="Poppins"/>
+          <w:sz w:val="26"/>
+          <w:szCs w:val="26"/>
+        </w:rPr>
+        <w:t>, male: SE.PRM.TENR.MA).</w:t>
       </w:r>
     </w:p>
     <w:p>
@@ -2530,7 +2688,43 @@
           <w:sz w:val="26"/>
           <w:szCs w:val="26"/>
         </w:rPr>
-        <w:t>Children and adolescents out of school (% of primary/lower secondary school age, e.g., SE.PRM.UNER.ZS, SE.SEC.UNER.LO.ZS).</w:t>
+        <w:t xml:space="preserve">Children and adolescents out of school (% of primary/lower secondary school age, e.g., </w:t>
+      </w:r>
+      <w:proofErr w:type="gramStart"/>
+      <w:r>
+        <w:rPr>
+          <w:rFonts w:ascii="Poppins" w:hAnsi="Poppins" w:cs="Poppins"/>
+          <w:sz w:val="26"/>
+          <w:szCs w:val="26"/>
+        </w:rPr>
+        <w:t>SE.PRM.UNER.ZS</w:t>
+      </w:r>
+      <w:proofErr w:type="gramEnd"/>
+      <w:r>
+        <w:rPr>
+          <w:rFonts w:ascii="Poppins" w:hAnsi="Poppins" w:cs="Poppins"/>
+          <w:sz w:val="26"/>
+          <w:szCs w:val="26"/>
+        </w:rPr>
+        <w:t>, SE.SEC.UNER.</w:t>
+      </w:r>
+      <w:proofErr w:type="gramStart"/>
+      <w:r>
+        <w:rPr>
+          <w:rFonts w:ascii="Poppins" w:hAnsi="Poppins" w:cs="Poppins"/>
+          <w:sz w:val="26"/>
+          <w:szCs w:val="26"/>
+        </w:rPr>
+        <w:t>LO.ZS</w:t>
+      </w:r>
+      <w:proofErr w:type="gramEnd"/>
+      <w:r>
+        <w:rPr>
+          <w:rFonts w:ascii="Poppins" w:hAnsi="Poppins" w:cs="Poppins"/>
+          <w:sz w:val="26"/>
+          <w:szCs w:val="26"/>
+        </w:rPr>
+        <w:t>).</w:t>
       </w:r>
     </w:p>
     <w:p>
@@ -2551,8 +2745,25 @@
           <w:sz w:val="26"/>
           <w:szCs w:val="26"/>
         </w:rPr>
-        <w:lastRenderedPageBreak/>
-        <w:t>Educational attainment (bachelor’s: SE.TER.CUAT.BA.ZS; lower secondary: SE.SEC.CUAT.LO.ZS).</w:t>
+        <w:t>Educational attainment (bachelor’s: SE.TER.CUAT.BA.ZS; lower secondary: SE.SEC.CUAT.</w:t>
+      </w:r>
+      <w:proofErr w:type="gramStart"/>
+      <w:r>
+        <w:rPr>
+          <w:rFonts w:ascii="Poppins" w:hAnsi="Poppins" w:cs="Poppins"/>
+          <w:sz w:val="26"/>
+          <w:szCs w:val="26"/>
+        </w:rPr>
+        <w:t>LO.ZS</w:t>
+      </w:r>
+      <w:proofErr w:type="gramEnd"/>
+      <w:r>
+        <w:rPr>
+          <w:rFonts w:ascii="Poppins" w:hAnsi="Poppins" w:cs="Poppins"/>
+          <w:sz w:val="26"/>
+          <w:szCs w:val="26"/>
+        </w:rPr>
+        <w:t>).</w:t>
       </w:r>
     </w:p>
     <w:p>
@@ -2573,6 +2784,7 @@
           <w:sz w:val="26"/>
           <w:szCs w:val="26"/>
         </w:rPr>
+        <w:lastRenderedPageBreak/>
         <w:t>Secondary/tertiary enrolment and teacher training metrics.</w:t>
       </w:r>
     </w:p>
@@ -2755,7 +2967,7 @@
           <w:sz w:val="26"/>
           <w:szCs w:val="26"/>
         </w:rPr>
-        <w:t xml:space="preserve">5. Social Protection and Child Labor Data </w:t>
+        <w:t xml:space="preserve">5. Social Protection and Labor Data </w:t>
       </w:r>
     </w:p>
     <w:p>
@@ -2918,8 +3130,43 @@
           <w:sz w:val="26"/>
           <w:szCs w:val="26"/>
         </w:rPr>
-        <w:lastRenderedPageBreak/>
-        <w:t>Child employment (% of children ages 7–14, total: SL.TLF.0714.ZS, female: SL.TLF.0714.FE.ZS, male: SL.TLF.0714.MA.ZS) and working hours (e.g., SL.TLF.0714.SW.TM).</w:t>
+        <w:t xml:space="preserve">Child employment (% of children ages 7–14, total: </w:t>
+      </w:r>
+      <w:proofErr w:type="gramStart"/>
+      <w:r>
+        <w:rPr>
+          <w:rFonts w:ascii="Poppins" w:hAnsi="Poppins" w:cs="Poppins"/>
+          <w:sz w:val="26"/>
+          <w:szCs w:val="26"/>
+        </w:rPr>
+        <w:t>SL.TLF.0714.ZS</w:t>
+      </w:r>
+      <w:proofErr w:type="gramEnd"/>
+      <w:r>
+        <w:rPr>
+          <w:rFonts w:ascii="Poppins" w:hAnsi="Poppins" w:cs="Poppins"/>
+          <w:sz w:val="26"/>
+          <w:szCs w:val="26"/>
+        </w:rPr>
+        <w:t xml:space="preserve">, female: </w:t>
+      </w:r>
+      <w:proofErr w:type="gramStart"/>
+      <w:r>
+        <w:rPr>
+          <w:rFonts w:ascii="Poppins" w:hAnsi="Poppins" w:cs="Poppins"/>
+          <w:sz w:val="26"/>
+          <w:szCs w:val="26"/>
+        </w:rPr>
+        <w:t>SL.TLF.0714.FE</w:t>
+      </w:r>
+      <w:proofErr w:type="gramEnd"/>
+      <w:r>
+        <w:rPr>
+          <w:rFonts w:ascii="Poppins" w:hAnsi="Poppins" w:cs="Poppins"/>
+          <w:sz w:val="26"/>
+          <w:szCs w:val="26"/>
+        </w:rPr>
+        <w:t>.ZS, male: SL.TLF.0714.MA.ZS) and working hours (e.g., SL.TLF.0714.SW.TM).</w:t>
       </w:r>
     </w:p>
     <w:p>
@@ -2940,7 +3187,62 @@
           <w:sz w:val="26"/>
           <w:szCs w:val="26"/>
         </w:rPr>
-        <w:t>Child employment by sector (agriculture: SL.AGR.0714.ZS, manufacturing: SL.MNF.0714.ZS, services: SL.SRV.0714.ZS).</w:t>
+        <w:lastRenderedPageBreak/>
+        <w:t xml:space="preserve">Child employment by sector (agriculture: </w:t>
+      </w:r>
+      <w:proofErr w:type="gramStart"/>
+      <w:r>
+        <w:rPr>
+          <w:rFonts w:ascii="Poppins" w:hAnsi="Poppins" w:cs="Poppins"/>
+          <w:sz w:val="26"/>
+          <w:szCs w:val="26"/>
+        </w:rPr>
+        <w:t>SL.AGR.0714.ZS</w:t>
+      </w:r>
+      <w:proofErr w:type="gramEnd"/>
+      <w:r>
+        <w:rPr>
+          <w:rFonts w:ascii="Poppins" w:hAnsi="Poppins" w:cs="Poppins"/>
+          <w:sz w:val="26"/>
+          <w:szCs w:val="26"/>
+        </w:rPr>
+        <w:t xml:space="preserve">, manufacturing: </w:t>
+      </w:r>
+      <w:proofErr w:type="gramStart"/>
+      <w:r>
+        <w:rPr>
+          <w:rFonts w:ascii="Poppins" w:hAnsi="Poppins" w:cs="Poppins"/>
+          <w:sz w:val="26"/>
+          <w:szCs w:val="26"/>
+        </w:rPr>
+        <w:t>SL.MNF.0714.ZS</w:t>
+      </w:r>
+      <w:proofErr w:type="gramEnd"/>
+      <w:r>
+        <w:rPr>
+          <w:rFonts w:ascii="Poppins" w:hAnsi="Poppins" w:cs="Poppins"/>
+          <w:sz w:val="26"/>
+          <w:szCs w:val="26"/>
+        </w:rPr>
+        <w:t xml:space="preserve">, services: </w:t>
+      </w:r>
+      <w:proofErr w:type="gramStart"/>
+      <w:r>
+        <w:rPr>
+          <w:rFonts w:ascii="Poppins" w:hAnsi="Poppins" w:cs="Poppins"/>
+          <w:sz w:val="26"/>
+          <w:szCs w:val="26"/>
+        </w:rPr>
+        <w:t>SL.SRV.0714.ZS</w:t>
+      </w:r>
+      <w:proofErr w:type="gramEnd"/>
+      <w:r>
+        <w:rPr>
+          <w:rFonts w:ascii="Poppins" w:hAnsi="Poppins" w:cs="Poppins"/>
+          <w:sz w:val="26"/>
+          <w:szCs w:val="26"/>
+        </w:rPr>
+        <w:t>).</w:t>
       </w:r>
     </w:p>
     <w:p>
@@ -2961,7 +3263,61 @@
           <w:sz w:val="26"/>
           <w:szCs w:val="26"/>
         </w:rPr>
-        <w:t>Unemployment rates by education level (basic: SL.UEM.BASC.ZS, intermediate: SL.UEM.INTM.ZS, advanced: SL.UEM.ADVN.ZS) and gender.</w:t>
+        <w:t xml:space="preserve">Unemployment rates by education level (basic: </w:t>
+      </w:r>
+      <w:proofErr w:type="gramStart"/>
+      <w:r>
+        <w:rPr>
+          <w:rFonts w:ascii="Poppins" w:hAnsi="Poppins" w:cs="Poppins"/>
+          <w:sz w:val="26"/>
+          <w:szCs w:val="26"/>
+        </w:rPr>
+        <w:t>SL.UEM.BASC.ZS</w:t>
+      </w:r>
+      <w:proofErr w:type="gramEnd"/>
+      <w:r>
+        <w:rPr>
+          <w:rFonts w:ascii="Poppins" w:hAnsi="Poppins" w:cs="Poppins"/>
+          <w:sz w:val="26"/>
+          <w:szCs w:val="26"/>
+        </w:rPr>
+        <w:t xml:space="preserve">, intermediate: </w:t>
+      </w:r>
+      <w:proofErr w:type="gramStart"/>
+      <w:r>
+        <w:rPr>
+          <w:rFonts w:ascii="Poppins" w:hAnsi="Poppins" w:cs="Poppins"/>
+          <w:sz w:val="26"/>
+          <w:szCs w:val="26"/>
+        </w:rPr>
+        <w:t>SL.UEM.INTM.ZS</w:t>
+      </w:r>
+      <w:proofErr w:type="gramEnd"/>
+      <w:r>
+        <w:rPr>
+          <w:rFonts w:ascii="Poppins" w:hAnsi="Poppins" w:cs="Poppins"/>
+          <w:sz w:val="26"/>
+          <w:szCs w:val="26"/>
+        </w:rPr>
+        <w:t xml:space="preserve">, advanced: </w:t>
+      </w:r>
+      <w:proofErr w:type="gramStart"/>
+      <w:r>
+        <w:rPr>
+          <w:rFonts w:ascii="Poppins" w:hAnsi="Poppins" w:cs="Poppins"/>
+          <w:sz w:val="26"/>
+          <w:szCs w:val="26"/>
+        </w:rPr>
+        <w:t>SL.UEM.ADVN.ZS</w:t>
+      </w:r>
+      <w:proofErr w:type="gramEnd"/>
+      <w:r>
+        <w:rPr>
+          <w:rFonts w:ascii="Poppins" w:hAnsi="Poppins" w:cs="Poppins"/>
+          <w:sz w:val="26"/>
+          <w:szCs w:val="26"/>
+        </w:rPr>
+        <w:t>) and gender.</w:t>
       </w:r>
     </w:p>
     <w:p>
@@ -2982,7 +3338,43 @@
           <w:sz w:val="26"/>
           <w:szCs w:val="26"/>
         </w:rPr>
-        <w:t>Vulnerable employment (% of employment, e.g., SL.EMP.VULN.ZS) and wage/salaried workers (SL.EMP.WORK.ZS).</w:t>
+        <w:t xml:space="preserve">Vulnerable employment (% of employment, e.g., </w:t>
+      </w:r>
+      <w:proofErr w:type="gramStart"/>
+      <w:r>
+        <w:rPr>
+          <w:rFonts w:ascii="Poppins" w:hAnsi="Poppins" w:cs="Poppins"/>
+          <w:sz w:val="26"/>
+          <w:szCs w:val="26"/>
+        </w:rPr>
+        <w:t>SL.EMP.VULN.ZS</w:t>
+      </w:r>
+      <w:proofErr w:type="gramEnd"/>
+      <w:r>
+        <w:rPr>
+          <w:rFonts w:ascii="Poppins" w:hAnsi="Poppins" w:cs="Poppins"/>
+          <w:sz w:val="26"/>
+          <w:szCs w:val="26"/>
+        </w:rPr>
+        <w:t>) and wage/salaried workers (</w:t>
+      </w:r>
+      <w:proofErr w:type="gramStart"/>
+      <w:r>
+        <w:rPr>
+          <w:rFonts w:ascii="Poppins" w:hAnsi="Poppins" w:cs="Poppins"/>
+          <w:sz w:val="26"/>
+          <w:szCs w:val="26"/>
+        </w:rPr>
+        <w:t>SL.EMP.WORK.ZS</w:t>
+      </w:r>
+      <w:proofErr w:type="gramEnd"/>
+      <w:r>
+        <w:rPr>
+          <w:rFonts w:ascii="Poppins" w:hAnsi="Poppins" w:cs="Poppins"/>
+          <w:sz w:val="26"/>
+          <w:szCs w:val="26"/>
+        </w:rPr>
+        <w:t>).</w:t>
       </w:r>
     </w:p>
     <w:p>
@@ -3144,46 +3536,46 @@
           <w:sz w:val="26"/>
           <w:szCs w:val="26"/>
         </w:rPr>
+        <w:t>Constant values for early years (1960–2000) and missing data for unemployment benefits (</w:t>
+      </w:r>
+      <w:proofErr w:type="spellStart"/>
+      <w:r>
+        <w:rPr>
+          <w:rFonts w:ascii="Poppins" w:hAnsi="Poppins" w:cs="Poppins"/>
+          <w:sz w:val="26"/>
+          <w:szCs w:val="26"/>
+        </w:rPr>
+        <w:t>per_lm_alllm.adq_pop_tot</w:t>
+      </w:r>
+      <w:proofErr w:type="spellEnd"/>
+      <w:r>
+        <w:rPr>
+          <w:rFonts w:ascii="Poppins" w:hAnsi="Poppins" w:cs="Poppins"/>
+          <w:sz w:val="26"/>
+          <w:szCs w:val="26"/>
+        </w:rPr>
+        <w:t>) indicate gaps.</w:t>
+      </w:r>
+    </w:p>
+    <w:p>
+      <w:pPr>
+        <w:rPr>
+          <w:rFonts w:ascii="Poppins" w:hAnsi="Poppins" w:cs="Poppins"/>
+          <w:b/>
+          <w:bCs/>
+          <w:sz w:val="26"/>
+          <w:szCs w:val="26"/>
+        </w:rPr>
+      </w:pPr>
+      <w:r>
+        <w:rPr>
+          <w:rFonts w:ascii="Poppins" w:hAnsi="Poppins" w:cs="Poppins"/>
+          <w:b/>
+          <w:bCs/>
+          <w:sz w:val="26"/>
+          <w:szCs w:val="26"/>
+        </w:rPr>
         <w:lastRenderedPageBreak/>
-        <w:t>Constant values for early years (1960–2000) and missing data for unemployment benefits (</w:t>
-      </w:r>
-      <w:proofErr w:type="spellStart"/>
-      <w:r>
-        <w:rPr>
-          <w:rFonts w:ascii="Poppins" w:hAnsi="Poppins" w:cs="Poppins"/>
-          <w:sz w:val="26"/>
-          <w:szCs w:val="26"/>
-        </w:rPr>
-        <w:t>per_lm_alllm.adq_pop_tot</w:t>
-      </w:r>
-      <w:proofErr w:type="spellEnd"/>
-      <w:r>
-        <w:rPr>
-          <w:rFonts w:ascii="Poppins" w:hAnsi="Poppins" w:cs="Poppins"/>
-          <w:sz w:val="26"/>
-          <w:szCs w:val="26"/>
-        </w:rPr>
-        <w:t>) indicate gaps.</w:t>
-      </w:r>
-    </w:p>
-    <w:p>
-      <w:pPr>
-        <w:rPr>
-          <w:rFonts w:ascii="Poppins" w:hAnsi="Poppins" w:cs="Poppins"/>
-          <w:b/>
-          <w:bCs/>
-          <w:sz w:val="26"/>
-          <w:szCs w:val="26"/>
-        </w:rPr>
-      </w:pPr>
-      <w:r>
-        <w:rPr>
-          <w:rFonts w:ascii="Poppins" w:hAnsi="Poppins" w:cs="Poppins"/>
-          <w:b/>
-          <w:bCs/>
-          <w:sz w:val="26"/>
-          <w:szCs w:val="26"/>
-        </w:rPr>
         <w:t xml:space="preserve">Use Case: </w:t>
       </w:r>
       <w:r>
@@ -3281,7 +3673,34 @@
           <w:sz w:val="26"/>
           <w:szCs w:val="26"/>
         </w:rPr>
-        <w:t>Details: You selected four features using data['Series Name'].</w:t>
+        <w:t xml:space="preserve">Details: You selected four features using </w:t>
+      </w:r>
+      <w:proofErr w:type="gramStart"/>
+      <w:r>
+        <w:rPr>
+          <w:rFonts w:ascii="Poppins" w:hAnsi="Poppins" w:cs="Poppins"/>
+          <w:sz w:val="26"/>
+          <w:szCs w:val="26"/>
+        </w:rPr>
+        <w:t>data[</w:t>
+      </w:r>
+      <w:proofErr w:type="gramEnd"/>
+      <w:r>
+        <w:rPr>
+          <w:rFonts w:ascii="Poppins" w:hAnsi="Poppins" w:cs="Poppins"/>
+          <w:sz w:val="26"/>
+          <w:szCs w:val="26"/>
+        </w:rPr>
+        <w:t>'Series Name'</w:t>
+      </w:r>
+      <w:proofErr w:type="gramStart"/>
+      <w:r>
+        <w:rPr>
+          <w:rFonts w:ascii="Poppins" w:hAnsi="Poppins" w:cs="Poppins"/>
+          <w:sz w:val="26"/>
+          <w:szCs w:val="26"/>
+        </w:rPr>
+        <w:t>].</w:t>
       </w:r>
       <w:proofErr w:type="spellStart"/>
       <w:r>
@@ -3293,6 +3712,7 @@
         <w:t>iloc</w:t>
       </w:r>
       <w:proofErr w:type="spellEnd"/>
+      <w:proofErr w:type="gramEnd"/>
       <w:r>
         <w:rPr>
           <w:rFonts w:ascii="Poppins" w:hAnsi="Poppins" w:cs="Poppins"/>
@@ -3430,7 +3850,7 @@
         </w:rPr>
         <w:lastRenderedPageBreak/>
         <w:drawing>
-          <wp:inline distT="0" distB="0" distL="0" distR="0" wp14:anchorId="37DD0146" wp14:editId="03CCF450">
+          <wp:inline distT="0" distB="0" distL="0" distR="0" wp14:anchorId="37DD0146" wp14:editId="791451DD">
             <wp:extent cx="5731510" cy="4082415"/>
             <wp:effectExtent l="0" t="0" r="2540" b="0"/>
             <wp:docPr id="20441262" name="Picture 1"/>
@@ -3546,7 +3966,34 @@
           <w:sz w:val="26"/>
           <w:szCs w:val="26"/>
         </w:rPr>
-        <w:t>Details: You selected the first five features using data['Series Name'].</w:t>
+        <w:t xml:space="preserve">Details: You selected the first five features using </w:t>
+      </w:r>
+      <w:proofErr w:type="gramStart"/>
+      <w:r>
+        <w:rPr>
+          <w:rFonts w:ascii="Poppins" w:hAnsi="Poppins" w:cs="Poppins"/>
+          <w:sz w:val="26"/>
+          <w:szCs w:val="26"/>
+        </w:rPr>
+        <w:t>data[</w:t>
+      </w:r>
+      <w:proofErr w:type="gramEnd"/>
+      <w:r>
+        <w:rPr>
+          <w:rFonts w:ascii="Poppins" w:hAnsi="Poppins" w:cs="Poppins"/>
+          <w:sz w:val="26"/>
+          <w:szCs w:val="26"/>
+        </w:rPr>
+        <w:t>'Series Name'</w:t>
+      </w:r>
+      <w:proofErr w:type="gramStart"/>
+      <w:r>
+        <w:rPr>
+          <w:rFonts w:ascii="Poppins" w:hAnsi="Poppins" w:cs="Poppins"/>
+          <w:sz w:val="26"/>
+          <w:szCs w:val="26"/>
+        </w:rPr>
+        <w:t>].</w:t>
       </w:r>
       <w:proofErr w:type="spellStart"/>
       <w:r>
@@ -3558,6 +4005,7 @@
         <w:t>iloc</w:t>
       </w:r>
       <w:proofErr w:type="spellEnd"/>
+      <w:proofErr w:type="gramEnd"/>
       <w:r>
         <w:rPr>
           <w:rFonts w:ascii="Poppins" w:hAnsi="Poppins" w:cs="Poppins"/>
@@ -4300,8 +4748,9 @@
           <w:sz w:val="64"/>
           <w:szCs w:val="64"/>
         </w:rPr>
-        <w:t>Phase – III</w:t>
-      </w:r>
+        <w:t xml:space="preserve">Phase – </w:t>
+      </w:r>
+      <w:proofErr w:type="gramStart"/>
       <w:r>
         <w:rPr>
           <w:rFonts w:ascii="Poppins" w:hAnsi="Poppins" w:cs="Poppins"/>
@@ -4310,7 +4759,28 @@
           <w:sz w:val="64"/>
           <w:szCs w:val="64"/>
         </w:rPr>
-        <w:t xml:space="preserve"> : Data Preprocessing</w:t>
+        <w:t>III</w:t>
+      </w:r>
+      <w:r>
+        <w:rPr>
+          <w:rFonts w:ascii="Poppins" w:hAnsi="Poppins" w:cs="Poppins"/>
+          <w:b/>
+          <w:bCs/>
+          <w:sz w:val="64"/>
+          <w:szCs w:val="64"/>
+        </w:rPr>
+        <w:t xml:space="preserve"> :</w:t>
+      </w:r>
+      <w:proofErr w:type="gramEnd"/>
+      <w:r>
+        <w:rPr>
+          <w:rFonts w:ascii="Poppins" w:hAnsi="Poppins" w:cs="Poppins"/>
+          <w:b/>
+          <w:bCs/>
+          <w:sz w:val="64"/>
+          <w:szCs w:val="64"/>
+        </w:rPr>
+        <w:t xml:space="preserve"> Data Preprocessing</w:t>
       </w:r>
     </w:p>
     <w:p>
@@ -4657,13 +5127,23 @@
         <w:t xml:space="preserve">: Loaded datasets using </w:t>
       </w:r>
       <w:proofErr w:type="spellStart"/>
-      <w:r>
-        <w:rPr>
-          <w:rFonts w:ascii="Poppins" w:hAnsi="Poppins" w:cs="Poppins"/>
-          <w:sz w:val="26"/>
-          <w:szCs w:val="26"/>
-        </w:rPr>
-        <w:t>pandas.read_csv</w:t>
+      <w:proofErr w:type="gramStart"/>
+      <w:r>
+        <w:rPr>
+          <w:rFonts w:ascii="Poppins" w:hAnsi="Poppins" w:cs="Poppins"/>
+          <w:sz w:val="26"/>
+          <w:szCs w:val="26"/>
+        </w:rPr>
+        <w:t>pandas.read</w:t>
+      </w:r>
+      <w:proofErr w:type="gramEnd"/>
+      <w:r>
+        <w:rPr>
+          <w:rFonts w:ascii="Poppins" w:hAnsi="Poppins" w:cs="Poppins"/>
+          <w:sz w:val="26"/>
+          <w:szCs w:val="26"/>
+        </w:rPr>
+        <w:t>_csv</w:t>
       </w:r>
       <w:proofErr w:type="spellEnd"/>
       <w:r>
@@ -4956,13 +5436,23 @@
         <w:t>year_cols</w:t>
       </w:r>
       <w:proofErr w:type="spellEnd"/>
-      <w:r>
-        <w:rPr>
-          <w:rFonts w:ascii="Poppins" w:hAnsi="Poppins" w:cs="Poppins"/>
-          <w:sz w:val="26"/>
-          <w:szCs w:val="26"/>
-        </w:rPr>
-        <w:t xml:space="preserve">].replace(['..', ''], </w:t>
+      <w:proofErr w:type="gramStart"/>
+      <w:r>
+        <w:rPr>
+          <w:rFonts w:ascii="Poppins" w:hAnsi="Poppins" w:cs="Poppins"/>
+          <w:sz w:val="26"/>
+          <w:szCs w:val="26"/>
+        </w:rPr>
+        <w:t>].replace</w:t>
+      </w:r>
+      <w:proofErr w:type="gramEnd"/>
+      <w:r>
+        <w:rPr>
+          <w:rFonts w:ascii="Poppins" w:hAnsi="Poppins" w:cs="Poppins"/>
+          <w:sz w:val="26"/>
+          <w:szCs w:val="26"/>
+        </w:rPr>
+        <w:t xml:space="preserve">(['..', ''], </w:t>
       </w:r>
       <w:proofErr w:type="spellStart"/>
       <w:r>
@@ -5023,9 +5513,19 @@
           <w:sz w:val="26"/>
           <w:szCs w:val="26"/>
         </w:rPr>
-        <w:t xml:space="preserve"> with row-wise means using apply(</w:t>
+        <w:t xml:space="preserve"> with row-wise means using </w:t>
+      </w:r>
+      <w:proofErr w:type="gramStart"/>
+      <w:r>
+        <w:rPr>
+          <w:rFonts w:ascii="Poppins" w:hAnsi="Poppins" w:cs="Poppins"/>
+          <w:sz w:val="26"/>
+          <w:szCs w:val="26"/>
+        </w:rPr>
+        <w:t>apply(</w:t>
       </w:r>
       <w:proofErr w:type="spellStart"/>
+      <w:proofErr w:type="gramEnd"/>
       <w:r>
         <w:rPr>
           <w:rFonts w:ascii="Poppins" w:hAnsi="Poppins" w:cs="Poppins"/>
@@ -5563,6 +6063,7 @@
         <w:t xml:space="preserve"> values (</w:t>
       </w:r>
       <w:proofErr w:type="spellStart"/>
+      <w:proofErr w:type="gramStart"/>
       <w:r>
         <w:rPr>
           <w:rFonts w:ascii="Poppins" w:hAnsi="Poppins" w:cs="Poppins"/>
@@ -5572,6 +6073,7 @@
         <w:t>np.mean</w:t>
       </w:r>
       <w:proofErr w:type="spellEnd"/>
+      <w:proofErr w:type="gramEnd"/>
       <w:r>
         <w:rPr>
           <w:rFonts w:ascii="Poppins" w:hAnsi="Poppins" w:cs="Poppins"/>
@@ -5605,6 +6107,7 @@
         <w:t>Median: Middle value (</w:t>
       </w:r>
       <w:proofErr w:type="spellStart"/>
+      <w:proofErr w:type="gramStart"/>
       <w:r>
         <w:rPr>
           <w:rFonts w:ascii="Poppins" w:hAnsi="Poppins" w:cs="Poppins"/>
@@ -5614,6 +6117,7 @@
         <w:t>np.median</w:t>
       </w:r>
       <w:proofErr w:type="spellEnd"/>
+      <w:proofErr w:type="gramEnd"/>
       <w:r>
         <w:rPr>
           <w:rFonts w:ascii="Poppins" w:hAnsi="Poppins" w:cs="Poppins"/>
@@ -5647,6 +6151,7 @@
         <w:t>Mode: Most frequent value (</w:t>
       </w:r>
       <w:proofErr w:type="spellStart"/>
+      <w:proofErr w:type="gramStart"/>
       <w:r>
         <w:rPr>
           <w:rFonts w:ascii="Poppins" w:hAnsi="Poppins" w:cs="Poppins"/>
@@ -5656,6 +6161,7 @@
         <w:t>pd.Series.mode</w:t>
       </w:r>
       <w:proofErr w:type="spellEnd"/>
+      <w:proofErr w:type="gramEnd"/>
       <w:r>
         <w:rPr>
           <w:rFonts w:ascii="Poppins" w:hAnsi="Poppins" w:cs="Poppins"/>
@@ -5768,6 +6274,7 @@
         <w:t xml:space="preserve"> and </w:t>
       </w:r>
       <w:proofErr w:type="spellStart"/>
+      <w:proofErr w:type="gramStart"/>
       <w:r>
         <w:rPr>
           <w:rFonts w:ascii="Poppins" w:hAnsi="Poppins" w:cs="Poppins"/>
@@ -5777,6 +6284,7 @@
         <w:t>np.corrcoef</w:t>
       </w:r>
       <w:proofErr w:type="spellEnd"/>
+      <w:proofErr w:type="gramEnd"/>
       <w:r>
         <w:rPr>
           <w:rFonts w:ascii="Poppins" w:hAnsi="Poppins" w:cs="Poppins"/>
@@ -6129,6 +6637,7 @@
         <w:t xml:space="preserve">import </w:t>
       </w:r>
       <w:proofErr w:type="spellStart"/>
+      <w:proofErr w:type="gramStart"/>
       <w:r>
         <w:rPr>
           <w:rFonts w:ascii="Poppins" w:hAnsi="Poppins" w:cs="Poppins"/>
@@ -6140,6 +6649,7 @@
         <w:t>matplotlib.pyplot</w:t>
       </w:r>
       <w:proofErr w:type="spellEnd"/>
+      <w:proofErr w:type="gramEnd"/>
       <w:r>
         <w:rPr>
           <w:rFonts w:ascii="Poppins" w:hAnsi="Poppins" w:cs="Poppins"/>
@@ -6229,6 +6739,7 @@
         <w:t xml:space="preserve">    </w:t>
       </w:r>
       <w:proofErr w:type="spellStart"/>
+      <w:proofErr w:type="gramStart"/>
       <w:r>
         <w:rPr>
           <w:rFonts w:ascii="Poppins" w:hAnsi="Poppins" w:cs="Poppins"/>
@@ -6240,6 +6751,7 @@
         <w:t>plt.figure</w:t>
       </w:r>
       <w:proofErr w:type="spellEnd"/>
+      <w:proofErr w:type="gramEnd"/>
       <w:r>
         <w:rPr>
           <w:rFonts w:ascii="Poppins" w:hAnsi="Poppins" w:cs="Poppins"/>
@@ -6262,6 +6774,7 @@
         <w:t>figsize</w:t>
       </w:r>
       <w:proofErr w:type="spellEnd"/>
+      <w:proofErr w:type="gramStart"/>
       <w:r>
         <w:rPr>
           <w:rFonts w:ascii="Poppins" w:hAnsi="Poppins" w:cs="Poppins"/>
@@ -6270,7 +6783,18 @@
           <w:szCs w:val="26"/>
           <w:u w:val="single"/>
         </w:rPr>
-        <w:t>=(10, 6))</w:t>
+        <w:t>=(</w:t>
+      </w:r>
+      <w:proofErr w:type="gramEnd"/>
+      <w:r>
+        <w:rPr>
+          <w:rFonts w:ascii="Poppins" w:hAnsi="Poppins" w:cs="Poppins"/>
+          <w:color w:val="156082" w:themeColor="accent1"/>
+          <w:sz w:val="26"/>
+          <w:szCs w:val="26"/>
+          <w:u w:val="single"/>
+        </w:rPr>
+        <w:t>10, 6))</w:t>
       </w:r>
     </w:p>
     <w:p>
@@ -6295,6 +6819,7 @@
         <w:t xml:space="preserve">    </w:t>
       </w:r>
       <w:proofErr w:type="spellStart"/>
+      <w:proofErr w:type="gramStart"/>
       <w:r>
         <w:rPr>
           <w:rFonts w:ascii="Poppins" w:hAnsi="Poppins" w:cs="Poppins"/>
@@ -6306,6 +6831,7 @@
         <w:t>sns.boxplot</w:t>
       </w:r>
       <w:proofErr w:type="spellEnd"/>
+      <w:proofErr w:type="gramEnd"/>
       <w:r>
         <w:rPr>
           <w:rFonts w:ascii="Poppins" w:hAnsi="Poppins" w:cs="Poppins"/>
@@ -6336,7 +6862,18 @@
           <w:szCs w:val="26"/>
           <w:u w:val="single"/>
         </w:rPr>
-        <w:t>[col].</w:t>
+        <w:t>[col</w:t>
+      </w:r>
+      <w:proofErr w:type="gramStart"/>
+      <w:r>
+        <w:rPr>
+          <w:rFonts w:ascii="Poppins" w:hAnsi="Poppins" w:cs="Poppins"/>
+          <w:color w:val="156082" w:themeColor="accent1"/>
+          <w:sz w:val="26"/>
+          <w:szCs w:val="26"/>
+          <w:u w:val="single"/>
+        </w:rPr>
+        <w:t>].</w:t>
       </w:r>
       <w:proofErr w:type="spellStart"/>
       <w:r>
@@ -6350,6 +6887,7 @@
         <w:t>dropna</w:t>
       </w:r>
       <w:proofErr w:type="spellEnd"/>
+      <w:proofErr w:type="gramEnd"/>
       <w:r>
         <w:rPr>
           <w:rFonts w:ascii="Poppins" w:hAnsi="Poppins" w:cs="Poppins"/>
@@ -6383,6 +6921,7 @@
         <w:t xml:space="preserve">    </w:t>
       </w:r>
       <w:proofErr w:type="spellStart"/>
+      <w:proofErr w:type="gramStart"/>
       <w:r>
         <w:rPr>
           <w:rFonts w:ascii="Poppins" w:hAnsi="Poppins" w:cs="Poppins"/>
@@ -6394,6 +6933,7 @@
         <w:t>plt.title</w:t>
       </w:r>
       <w:proofErr w:type="spellEnd"/>
+      <w:proofErr w:type="gramEnd"/>
       <w:r>
         <w:rPr>
           <w:rFonts w:ascii="Poppins" w:hAnsi="Poppins" w:cs="Poppins"/>
@@ -6450,6 +6990,7 @@
         <w:t xml:space="preserve">    </w:t>
       </w:r>
       <w:proofErr w:type="spellStart"/>
+      <w:proofErr w:type="gramStart"/>
       <w:r>
         <w:rPr>
           <w:rFonts w:ascii="Poppins" w:hAnsi="Poppins" w:cs="Poppins"/>
@@ -6461,6 +7002,7 @@
         <w:t>plt.savefig</w:t>
       </w:r>
       <w:proofErr w:type="spellEnd"/>
+      <w:proofErr w:type="gramEnd"/>
       <w:r>
         <w:rPr>
           <w:rFonts w:ascii="Poppins" w:hAnsi="Poppins" w:cs="Poppins"/>
@@ -6494,6 +7036,7 @@
         <w:t xml:space="preserve">    </w:t>
       </w:r>
       <w:proofErr w:type="spellStart"/>
+      <w:proofErr w:type="gramStart"/>
       <w:r>
         <w:rPr>
           <w:rFonts w:ascii="Poppins" w:hAnsi="Poppins" w:cs="Poppins"/>
@@ -6505,6 +7048,7 @@
         <w:t>plt.close</w:t>
       </w:r>
       <w:proofErr w:type="spellEnd"/>
+      <w:proofErr w:type="gramEnd"/>
       <w:r>
         <w:rPr>
           <w:rFonts w:ascii="Poppins" w:hAnsi="Poppins" w:cs="Poppins"/>
@@ -6550,7 +7094,7 @@
           <w:lang w:val="en-US"/>
         </w:rPr>
         <w:drawing>
-          <wp:inline distT="0" distB="0" distL="0" distR="0" wp14:anchorId="6AF38CC3" wp14:editId="5159F9B2">
+          <wp:inline distT="0" distB="0" distL="0" distR="0" wp14:anchorId="6AF38CC3" wp14:editId="4D7E15BA">
             <wp:extent cx="5731510" cy="2456180"/>
             <wp:effectExtent l="0" t="0" r="2540" b="1270"/>
             <wp:docPr id="577306061" name="Picture 7"/>
@@ -7850,7 +8394,16 @@
           <w:sz w:val="26"/>
           <w:szCs w:val="26"/>
         </w:rPr>
-        <w:t xml:space="preserve">) was loaded into a pandas </w:t>
+        <w:t xml:space="preserve">) was loaded into a </w:t>
+      </w:r>
+      <w:proofErr w:type="gramStart"/>
+      <w:r>
+        <w:rPr>
+          <w:rFonts w:ascii="Poppins" w:eastAsia="Times New Roman" w:hAnsi="Poppins" w:cs="Times New Roman"/>
+          <w:sz w:val="26"/>
+          <w:szCs w:val="26"/>
+        </w:rPr>
+        <w:t xml:space="preserve">pandas </w:t>
       </w:r>
       <w:proofErr w:type="spellStart"/>
       <w:r>
@@ -7862,6 +8415,7 @@
         <w:t>DataFrame</w:t>
       </w:r>
       <w:proofErr w:type="spellEnd"/>
+      <w:proofErr w:type="gramEnd"/>
       <w:r>
         <w:rPr>
           <w:rFonts w:ascii="Poppins" w:eastAsia="Times New Roman" w:hAnsi="Poppins" w:cs="Times New Roman"/>
@@ -9062,7 +9616,25 @@
           <w:sz w:val="26"/>
           <w:szCs w:val="26"/>
         </w:rPr>
-        <w:t>"Rural poverty headcount ratio" and "Urban poverty headcount ratio" may be strongly correlated, reflecting that economic conditions affecting poverty (e.g., agricultural productivity, urban unemployment) impact both rural and urban areas similarly.</w:t>
+        <w:t xml:space="preserve">"Rural poverty headcount ratio" and "Urban poverty headcount ratio" may be strongly correlated, reflecting </w:t>
+      </w:r>
+      <w:proofErr w:type="gramStart"/>
+      <w:r>
+        <w:rPr>
+          <w:rFonts w:ascii="Poppins" w:eastAsia="Times New Roman" w:hAnsi="Poppins" w:cs="Times New Roman"/>
+          <w:sz w:val="26"/>
+          <w:szCs w:val="26"/>
+        </w:rPr>
+        <w:t>that economic conditions</w:t>
+      </w:r>
+      <w:proofErr w:type="gramEnd"/>
+      <w:r>
+        <w:rPr>
+          <w:rFonts w:ascii="Poppins" w:eastAsia="Times New Roman" w:hAnsi="Poppins" w:cs="Times New Roman"/>
+          <w:sz w:val="26"/>
+          <w:szCs w:val="26"/>
+        </w:rPr>
+        <w:t xml:space="preserve"> affecting poverty (e.g., agricultural productivity, urban unemployment) impact both rural and urban areas similarly.</w:t>
       </w:r>
     </w:p>
     <w:p>
@@ -17044,6 +17616,7 @@
   <w:style w:type="character" w:default="1" w:styleId="DefaultParagraphFont">
     <w:name w:val="Default Paragraph Font"/>
     <w:uiPriority w:val="1"/>
+    <w:semiHidden/>
     <w:unhideWhenUsed/>
   </w:style>
   <w:style w:type="table" w:default="1" w:styleId="TableNormal">

</xml_diff>